<commit_message>
court(cavc) answering-brief: typst/docx on the shared cross-engine layout model; XENG-001..003 pass on docx, params.cross_engine: gate (fb-595.54.6)
</commit_message>
<xml_diff>
--- a/courts/federal-circuit/court-of-veteran-appeals/answering-brief/docx/reference.docx
+++ b/courts/federal-circuit/court-of-veteran-appeals/answering-brief/docx/reference.docx
@@ -7,9 +7,7 @@
         <w:pStyle w:val="Title"/>
       </w:pPr>
       <w:r>
-        <w:t xml:space="preserve">
-Title
-</w:t>
+        <w:t xml:space="preserve">Title</w:t>
       </w:r>
     </w:p>
     <w:p>
@@ -17,9 +15,7 @@
         <w:pStyle w:val="Subtitle"/>
       </w:pPr>
       <w:r>
-        <w:t xml:space="preserve">
-Subtitle
-</w:t>
+        <w:t xml:space="preserve">Subtitle</w:t>
       </w:r>
     </w:p>
     <w:p>
@@ -27,9 +23,7 @@
         <w:pStyle w:val="Author"/>
       </w:pPr>
       <w:r>
-        <w:t xml:space="preserve">
-Author
-</w:t>
+        <w:t xml:space="preserve">Author</w:t>
       </w:r>
     </w:p>
     <w:p>
@@ -37,9 +31,7 @@
         <w:pStyle w:val="Date"/>
       </w:pPr>
       <w:r>
-        <w:t xml:space="preserve">
-Date
-</w:t>
+        <w:t xml:space="preserve">Date</w:t>
       </w:r>
     </w:p>
     <w:p>
@@ -47,9 +39,7 @@
         <w:pStyle w:val="Abstract"/>
       </w:pPr>
       <w:r>
-        <w:t xml:space="preserve">
-Abstract
-</w:t>
+        <w:t xml:space="preserve">Abstract</w:t>
       </w:r>
     </w:p>
     <w:p>
@@ -58,9 +48,7 @@
       </w:pPr>
       <w:bookmarkStart w:id="21" w:name="heading-1"/>
       <w:r>
-        <w:t xml:space="preserve">
-Heading 1
-</w:t>
+        <w:t xml:space="preserve">Heading 1</w:t>
       </w:r>
       <w:bookmarkEnd w:id="21"/>
     </w:p>
@@ -70,9 +58,7 @@
       </w:pPr>
       <w:bookmarkStart w:id="22" w:name="heading-2"/>
       <w:r>
-        <w:t xml:space="preserve">
-Heading 2
-</w:t>
+        <w:t xml:space="preserve">Heading 2</w:t>
       </w:r>
       <w:bookmarkEnd w:id="22"/>
     </w:p>
@@ -82,9 +68,7 @@
       </w:pPr>
       <w:bookmarkStart w:id="23" w:name="heading-3"/>
       <w:r>
-        <w:t xml:space="preserve">
-Heading 3
-</w:t>
+        <w:t xml:space="preserve">Heading 3</w:t>
       </w:r>
       <w:bookmarkEnd w:id="23"/>
     </w:p>
@@ -94,9 +78,7 @@
       </w:pPr>
       <w:bookmarkStart w:id="24" w:name="heading-4"/>
       <w:r>
-        <w:t xml:space="preserve">
-Heading 4
-</w:t>
+        <w:t xml:space="preserve">Heading 4</w:t>
       </w:r>
       <w:bookmarkEnd w:id="24"/>
     </w:p>
@@ -106,9 +88,7 @@
       </w:pPr>
       <w:bookmarkStart w:id="25" w:name="heading-5"/>
       <w:r>
-        <w:t xml:space="preserve">
-Heading 5
-</w:t>
+        <w:t xml:space="preserve">Heading 5</w:t>
       </w:r>
       <w:bookmarkEnd w:id="25"/>
     </w:p>
@@ -118,9 +98,7 @@
       </w:pPr>
       <w:bookmarkStart w:id="26" w:name="heading-6"/>
       <w:r>
-        <w:t xml:space="preserve">
-Heading 6
-</w:t>
+        <w:t xml:space="preserve">Heading 6</w:t>
       </w:r>
       <w:bookmarkEnd w:id="26"/>
     </w:p>
@@ -130,9 +108,7 @@
       </w:pPr>
       <w:bookmarkStart w:id="27" w:name="heading-7"/>
       <w:r>
-        <w:t xml:space="preserve">
-Heading 7
-</w:t>
+        <w:t xml:space="preserve">Heading 7</w:t>
       </w:r>
       <w:bookmarkEnd w:id="27"/>
     </w:p>
@@ -142,9 +118,7 @@
       </w:pPr>
       <w:bookmarkStart w:id="28" w:name="heading-8"/>
       <w:r>
-        <w:t xml:space="preserve">
-Heading 8
-</w:t>
+        <w:t xml:space="preserve">Heading 8</w:t>
       </w:r>
       <w:bookmarkEnd w:id="28"/>
     </w:p>
@@ -154,9 +128,7 @@
       </w:pPr>
       <w:bookmarkStart w:id="29" w:name="heading-9"/>
       <w:r>
-        <w:t xml:space="preserve">
-Heading 9
-</w:t>
+        <w:t xml:space="preserve">Heading 9</w:t>
       </w:r>
       <w:bookmarkEnd w:id="29"/>
     </w:p>
@@ -165,9 +137,7 @@
         <w:pStyle w:val="FirstParagraph"/>
       </w:pPr>
       <w:r>
-        <w:t xml:space="preserve">
-First Paragraph.
-</w:t>
+        <w:t xml:space="preserve">First Paragraph.</w:t>
       </w:r>
     </w:p>
     <w:p>
@@ -175,54 +145,39 @@
         <w:pStyle w:val="BodyText"/>
       </w:pPr>
       <w:r>
-        <w:t xml:space="preserve">
-Body Text. Body Text Char.
-</w:t>
-      </w:r>
-      <w:r>
-        <w:t xml:space="preserve">
-</w:t>
+        <w:t xml:space="preserve">Body Text. Body Text Char.</w:t>
+      </w:r>
+      <w:r>
+        <w:t xml:space="preserve"> </w:t>
       </w:r>
       <w:r>
         <w:rPr>
           <w:rStyle w:val="VerbatimChar"/>
         </w:rPr>
-        <w:t xml:space="preserve">
-Verbatim Char
-</w:t>
-      </w:r>
-      <w:r>
-        <w:t xml:space="preserve">
-.
-</w:t>
-      </w:r>
-      <w:r>
-        <w:t xml:space="preserve">
-</w:t>
+        <w:t xml:space="preserve">Verbatim Char</w:t>
+      </w:r>
+      <w:r>
+        <w:t xml:space="preserve">.</w:t>
+      </w:r>
+      <w:r>
+        <w:t xml:space="preserve"> </w:t>
       </w:r>
       <w:hyperlink r:id="rId30">
         <w:r>
           <w:rPr>
             <w:rStyle w:val="Hyperlink"/>
           </w:rPr>
-          <w:t xml:space="preserve">
-Hyperlink
-</w:t>
+          <w:t xml:space="preserve">Hyperlink</w:t>
         </w:r>
       </w:hyperlink>
       <w:r>
-        <w:t xml:space="preserve">
-.
-</w:t>
-      </w:r>
-      <w:r>
-        <w:t xml:space="preserve">
-</w:t>
-      </w:r>
-      <w:r>
-        <w:t xml:space="preserve">
-Footnote.
-</w:t>
+        <w:t xml:space="preserve">.</w:t>
+      </w:r>
+      <w:r>
+        <w:t xml:space="preserve"> </w:t>
+      </w:r>
+      <w:r>
+        <w:t xml:space="preserve">Footnote.</w:t>
       </w:r>
       <w:r>
         <w:rPr>
@@ -236,9 +191,7 @@
         <w:pStyle w:val="BlockText"/>
       </w:pPr>
       <w:r>
-        <w:t xml:space="preserve">
-Block Text.
-</w:t>
+        <w:t xml:space="preserve">Block Text.</w:t>
       </w:r>
     </w:p>
     <w:p>
@@ -246,9 +199,7 @@
         <w:pStyle w:val="TableCaption"/>
       </w:pPr>
       <w:r>
-        <w:t xml:space="preserve">
-Table caption.
-</w:t>
+        <w:t xml:space="preserve">Table caption.</w:t>
       </w:r>
     </w:p>
     <w:tbl>
@@ -275,9 +226,7 @@
               <w:jc w:val="left"/>
             </w:pPr>
             <w:r>
-              <w:t xml:space="preserve">
-Table
-</w:t>
+              <w:t xml:space="preserve">Table</w:t>
             </w:r>
           </w:p>
         </w:tc>
@@ -294,9 +243,7 @@
               <w:jc w:val="left"/>
             </w:pPr>
             <w:r>
-              <w:t xml:space="preserve">
-Table
-</w:t>
+              <w:t xml:space="preserve">Table</w:t>
             </w:r>
           </w:p>
         </w:tc>
@@ -309,9 +256,7 @@
               <w:jc w:val="left"/>
             </w:pPr>
             <w:r>
-              <w:t xml:space="preserve">
-1
-</w:t>
+              <w:t xml:space="preserve">1</w:t>
             </w:r>
           </w:p>
         </w:tc>
@@ -322,9 +267,7 @@
               <w:jc w:val="left"/>
             </w:pPr>
             <w:r>
-              <w:t xml:space="preserve">
-2
-</w:t>
+              <w:t xml:space="preserve">2</w:t>
             </w:r>
           </w:p>
         </w:tc>
@@ -335,9 +278,7 @@
         <w:pStyle w:val="ImageCaption"/>
       </w:pPr>
       <w:r>
-        <w:t xml:space="preserve">
-Image Caption
-</w:t>
+        <w:t xml:space="preserve">Image Caption</w:t>
       </w:r>
     </w:p>
     <w:p>
@@ -345,9 +286,7 @@
         <w:pStyle w:val="DefinitionTerm"/>
       </w:pPr>
       <w:r>
-        <w:t xml:space="preserve">
-DefinitionTerm
-</w:t>
+        <w:t xml:space="preserve">DefinitionTerm</w:t>
       </w:r>
     </w:p>
     <w:p>
@@ -355,9 +294,7 @@
         <w:pStyle w:val="Definition"/>
       </w:pPr>
       <w:r>
-        <w:t xml:space="preserve">
-Definition
-</w:t>
+        <w:t xml:space="preserve">Definition</w:t>
       </w:r>
     </w:p>
     <w:p>
@@ -365,9 +302,7 @@
         <w:pStyle w:val="DefinitionTerm"/>
       </w:pPr>
       <w:r>
-        <w:t xml:space="preserve">
-DefinitionTerm
-</w:t>
+        <w:t xml:space="preserve">DefinitionTerm</w:t>
       </w:r>
     </w:p>
     <w:p>
@@ -375,19 +310,13 @@
         <w:pStyle w:val="Definition"/>
       </w:pPr>
       <w:r>
-        <w:t xml:space="preserve">
-Definition
-</w:t>
+        <w:t xml:space="preserve">Definition</w:t>
       </w:r>
     </w:p>
     <w:sectPr>
       <w:footerReference w:type="default" r:id="rIdFooter1"/>
-      <w:footnotePr>
-        <w:numRestart w:val="eachSect"/>
-      </w:footnotePr>
       <w:pgSz w:w="12240" w:h="15840"/>
       <w:pgMar w:top="1440" w:right="1440" w:bottom="1440" w:left="1440" w:header="720" w:footer="432" w:gutter="0"/>
-      <w:pgNumType w:fmt="lowerRoman" w:start="1"/>
     </w:sectPr>
   </w:body>
 </w:document>
@@ -422,16 +351,6 @@
 </w:ftr>
 </file>
 
-<file path=word/footer2.xml><?xml version="1.0" encoding="utf-8"?>
-<w:ftr xmlns:w="http://schemas.openxmlformats.org/wordprocessingml/2006/main" xmlns:r="http://schemas.openxmlformats.org/officeDocument/2006/relationships">
-  <w:p>
-    <w:pPr>
-      <w:spacing w:after="0"/>
-    </w:pPr>
-  </w:p>
-</w:ftr>
-</file>
-
 <file path=word/footnotes.xml><?xml version="1.0" encoding="utf-8"?>
 <w:footnotes xmlns:w="http://schemas.openxmlformats.org/wordprocessingml/2006/main" xmlns:m="http://schemas.openxmlformats.org/officeDocument/2006/math" xmlns:r="http://schemas.openxmlformats.org/officeDocument/2006/relationships" xmlns:o="urn:schemas-microsoft-com:office:office" xmlns:v="urn:schemas-microsoft-com:vml" xmlns:w10="urn:schemas-microsoft-com:office:word" xmlns:a="http://schemas.openxmlformats.org/drawingml/2006/main" xmlns:pic="http://schemas.openxmlformats.org/drawingml/2006/picture" xmlns:wp="http://schemas.openxmlformats.org/drawingml/2006/wordprocessingDrawing">
   <w:footnote w:type="continuationSeparator" w:id="0">
@@ -460,10 +379,15 @@
         <w:footnoteRef/>
       </w:r>
       <w:r>
-        <w:t xml:space="preserve"> </w:t>
-      </w:r>
-      <w:r>
-        <w:t xml:space="preserve">Footnote Text.</w:t>
+        <w:t>Footnote Text.</w:t>
+      </w:r>
+    </w:p>
+    <w:p>
+      <w:pPr>
+        <w:pStyle w:val="FootnoteBlockText"/>
+      </w:pPr>
+      <w:r>
+        <w:t>Footnote Block Text</w:t>
       </w:r>
     </w:p>
   </w:footnote>
@@ -586,14 +510,15 @@
   <w:docDefaults>
     <w:rPrDefault>
       <w:rPr>
-        <w:rFonts w:ascii="EB Garamond" w:hAnsi="EB Garamond" w:eastAsia="EB Garamond" w:cs="EB Garamond"/>
+        <w:rFonts w:ascii="Liberation Sans" w:hAnsi="Liberation Sans" w:eastAsia="Liberation Sans" w:cs="Liberation Sans"/>
         <w:sz w:val="28"/>
         <w:szCs w:val="28"/>
-        <w:lang w:val="en-US" w:eastAsia="en-US" w:bidi="ar-SA"/>
+        <w:lang w:val="en-US" w:eastAsia="zh-CN" w:bidi="ar-SA"/>
       </w:rPr>
     </w:rPrDefault>
     <w:pPrDefault>
       <w:pPr>
+        <w:widowControl/>
         <w:spacing w:after="0"/>
       </w:pPr>
     </w:pPrDefault>
@@ -609,7 +534,7 @@
     <w:link w:val="BodyTextChar"/>
     <w:qFormat/>
     <w:pPr>
-      <w:spacing w:before="0" w:after="0" w:line="629" w:lineRule="exact"/>
+      <w:spacing w:before="0" w:after="0" w:line="588" w:lineRule="exact"/>
       <w:ind w:firstLine="720"/>
     </w:pPr>
   </w:style>
@@ -771,13 +696,13 @@
     <w:pPr>
       <w:keepNext/>
       <w:keepLines/>
-      <w:spacing w:before="240" w:after="120" w:line="240" w:lineRule="auto"/>
+      <w:spacing w:before="240" w:after="120" w:line="400" w:lineRule="exact"/>
       <w:ind w:firstLine="0"/>
       <w:jc w:val="center"/>
       <w:outlineLvl w:val="0"/>
     </w:pPr>
     <w:rPr>
-      <w:rFonts w:ascii="EB Garamond" w:hAnsi="EB Garamond" w:eastAsia="EB Garamond" w:cs="EB Garamond"/>
+      <w:rFonts w:ascii="Liberation Sans" w:hAnsi="Liberation Sans" w:eastAsia="Liberation Sans" w:cs="Liberation Sans"/>
       <w:b/>
       <w:bCs/>
       <w:caps/>
@@ -799,12 +724,12 @@
     <w:pPr>
       <w:keepNext/>
       <w:keepLines/>
-      <w:spacing w:before="240" w:after="120" w:line="240" w:lineRule="auto"/>
+      <w:spacing w:before="240" w:after="120" w:line="400" w:lineRule="exact"/>
       <w:ind w:firstLine="0"/>
       <w:outlineLvl w:val="1"/>
     </w:pPr>
     <w:rPr>
-      <w:rFonts w:ascii="EB Garamond" w:hAnsi="EB Garamond" w:eastAsia="EB Garamond" w:cs="EB Garamond"/>
+      <w:rFonts w:ascii="Liberation Sans" w:hAnsi="Liberation Sans" w:eastAsia="Liberation Sans" w:cs="Liberation Sans"/>
       <w:b/>
       <w:bCs/>
       <w:color w:val="000000"/>
@@ -825,12 +750,12 @@
     <w:pPr>
       <w:keepNext/>
       <w:keepLines/>
-      <w:spacing w:before="240" w:after="120" w:line="240" w:lineRule="auto"/>
+      <w:spacing w:before="240" w:after="120" w:line="400" w:lineRule="exact"/>
       <w:ind w:firstLine="0"/>
       <w:outlineLvl w:val="2"/>
     </w:pPr>
     <w:rPr>
-      <w:rFonts w:ascii="EB Garamond" w:hAnsi="EB Garamond" w:eastAsia="EB Garamond" w:cs="EB Garamond"/>
+      <w:rFonts w:ascii="Liberation Sans" w:hAnsi="Liberation Sans" w:eastAsia="Liberation Sans" w:cs="Liberation Sans"/>
       <w:b/>
       <w:bCs/>
       <w:color w:val="000000"/>
@@ -851,12 +776,12 @@
     <w:pPr>
       <w:keepNext/>
       <w:keepLines/>
-      <w:spacing w:before="240" w:after="120" w:line="240" w:lineRule="auto"/>
+      <w:spacing w:before="240" w:after="120" w:line="400" w:lineRule="exact"/>
       <w:ind w:firstLine="0"/>
       <w:outlineLvl w:val="3"/>
     </w:pPr>
     <w:rPr>
-      <w:rFonts w:ascii="EB Garamond" w:hAnsi="EB Garamond" w:eastAsia="EB Garamond" w:cs="EB Garamond"/>
+      <w:rFonts w:ascii="Liberation Sans" w:hAnsi="Liberation Sans" w:eastAsia="Liberation Sans" w:cs="Liberation Sans"/>
       <w:b/>
       <w:bCs/>
       <w:i/>
@@ -878,12 +803,12 @@
     <w:pPr>
       <w:keepNext/>
       <w:keepLines/>
-      <w:spacing w:before="240" w:after="120" w:line="240" w:lineRule="auto"/>
+      <w:spacing w:before="240" w:after="120" w:line="400" w:lineRule="exact"/>
       <w:ind w:firstLine="0"/>
       <w:outlineLvl w:val="4"/>
     </w:pPr>
     <w:rPr>
-      <w:rFonts w:ascii="EB Garamond" w:hAnsi="EB Garamond" w:eastAsia="EB Garamond" w:cs="EB Garamond"/>
+      <w:rFonts w:ascii="Liberation Sans" w:hAnsi="Liberation Sans" w:eastAsia="Liberation Sans" w:cs="Liberation Sans"/>
       <w:b/>
       <w:bCs/>
       <w:i/>
@@ -1099,6 +1024,15 @@
       <w:color w:val="272727" w:themeColor="text1" w:themeTint="D8"/>
     </w:rPr>
   </w:style>
+  <w:style w:type="paragraph" w:customStyle="1" w:styleId="ListItem">
+    <w:name w:val="List Item"/>
+    <w:basedOn w:val="BodyText"/>
+    <w:qFormat/>
+    <w:pPr>
+      <w:spacing w:before="0" w:after="0" w:line="588" w:lineRule="exact"/>
+      <w:ind w:left="720" w:hanging="720"/>
+    </w:pPr>
+  </w:style>
   <w:style w:type="paragraph" w:styleId="BlockText">
     <w:name w:val="Block Text"/>
     <w:basedOn w:val="BodyText"/>
@@ -1107,7 +1041,7 @@
     <w:unhideWhenUsed/>
     <w:qFormat/>
     <w:pPr>
-      <w:spacing w:before="0" w:after="180" w:line="240" w:lineRule="auto"/>
+      <w:spacing w:before="280" w:after="280" w:line="340" w:lineRule="exact"/>
       <w:ind w:firstLine="0" w:left="720" w:right="720"/>
     </w:pPr>
   </w:style>
@@ -1119,7 +1053,8 @@
     <w:unhideWhenUsed/>
     <w:qFormat/>
     <w:pPr>
-      <w:spacing w:before="0" w:after="120" w:line="240" w:lineRule="auto"/>
+      <w:keepLines/>
+      <w:spacing w:before="0" w:after="140" w:line="340" w:lineRule="exact"/>
     </w:pPr>
     <w:rPr>
       <w:sz w:val="28"/>
@@ -1134,8 +1069,8 @@
     <w:unhideWhenUsed/>
     <w:qFormat/>
     <w:pPr>
-      <w:spacing w:before="100" w:after="100"/>
-      <w:ind w:firstLine="0" w:left="480" w:right="480"/>
+      <w:spacing w:before="280" w:after="280"/>
+      <w:ind w:firstLine="0" w:left="720" w:right="720"/>
     </w:pPr>
   </w:style>
   <w:style w:type="character" w:default="1" w:styleId="DefaultParagraphFont">
@@ -1146,8 +1081,6 @@
   <w:style w:type="table" w:default="1" w:styleId="Table">
     <w:name w:val="Table"/>
     <w:basedOn w:val="TableNormal"/>
-    <w:semiHidden/>
-    <w:unhideWhenUsed/>
     <w:qFormat/>
     <w:tblPr>
       <w:tblInd w:w="0" w:type="dxa"/>
@@ -1159,13 +1092,6 @@
       </w:tblCellMar>
     </w:tblPr>
     <w:tblStylePr w:type="firstRow">
-      <w:tblPr>
-        <w:jc w:val="left"/>
-        <w:tblInd w:w="0" w:type="dxa"/>
-      </w:tblPr>
-      <w:trPr>
-        <w:jc w:val="left"/>
-      </w:trPr>
       <w:tcPr>
         <w:tcBorders>
           <w:bottom w:val="single"/>
@@ -1252,7 +1178,7 @@
     <w:name w:val="Hyperlink"/>
     <w:basedOn w:val="BodyTextChar"/>
     <w:rPr>
-      <w:color w:val="4F81BD" w:themeColor="accent1"/>
+      <w:color w:val="000000"/>
     </w:rPr>
   </w:style>
   <w:style w:type="paragraph" w:styleId="TOCHeading">
@@ -1271,180 +1197,6 @@
       <w:b w:val="0"/>
       <w:bCs w:val="0"/>
       <w:color w:val="365F91" w:themeColor="accent1" w:themeShade="BF"/>
-    </w:rPr>
-  </w:style>
-  <w:style w:type="paragraph" w:customStyle="1" w:styleId="Centered">
-    <w:name w:val="Centered"/>
-    <w:basedOn w:val="Normal"/>
-    <w:qFormat/>
-    <w:pPr>
-      <w:spacing w:before="0" w:after="0" w:line="240" w:lineRule="auto"/>
-      <w:ind w:firstLine="0"/>
-      <w:jc w:val="center"/>
-    </w:pPr>
-    <w:rPr>
-      <w:sz w:val="28"/>
-      <w:szCs w:val="28"/>
-    </w:rPr>
-  </w:style>
-  <w:style w:type="paragraph" w:customStyle="1" w:styleId="Single">
-    <w:name w:val="Single"/>
-    <w:basedOn w:val="Normal"/>
-    <w:qFormat/>
-    <w:pPr>
-      <w:spacing w:before="0" w:after="200" w:line="240" w:lineRule="auto"/>
-      <w:ind w:firstLine="0"/>
-    </w:pPr>
-  </w:style>
-  <w:style w:type="paragraph" w:customStyle="1" w:styleId="Keep">
-    <w:name w:val="Keep"/>
-    <w:basedOn w:val="Single"/>
-    <w:qFormat/>
-    <w:pPr>
-      <w:keepNext/>
-      <w:keepLines/>
-    </w:pPr>
-  </w:style>
-  <w:style w:type="paragraph" w:customStyle="1" w:styleId="Counsel">
-    <w:name w:val="Counsel"/>
-    <w:basedOn w:val="Normal"/>
-    <w:qFormat/>
-    <w:pPr>
-      <w:spacing w:before="0" w:after="0" w:line="240" w:lineRule="auto"/>
-      <w:ind w:left="4680" w:firstLine="0"/>
-    </w:pPr>
-  </w:style>
-  <w:style w:type="paragraph" w:customStyle="1" w:styleId="DoubleRule">
-    <w:name w:val="Double Rule"/>
-    <w:basedOn w:val="Normal"/>
-    <w:qFormat/>
-    <w:pPr>
-      <w:pBdr>
-        <w:bottom w:val="double" w:sz="6" w:space="1" w:color="000000"/>
-      </w:pBdr>
-      <w:spacing w:before="0" w:after="240" w:line="240" w:lineRule="auto"/>
-      <w:ind w:firstLine="0"/>
-    </w:pPr>
-  </w:style>
-  <w:style w:type="paragraph" w:customStyle="1" w:styleId="ShortRule">
-    <w:name w:val="Short Rule"/>
-    <w:basedOn w:val="Normal"/>
-    <w:qFormat/>
-    <w:pPr>
-      <w:pBdr>
-        <w:bottom w:val="single" w:sz="6" w:space="1" w:color="000000"/>
-      </w:pBdr>
-      <w:spacing w:before="0" w:after="240" w:line="240" w:lineRule="auto"/>
-      <w:ind w:left="3240" w:right="3240" w:firstLine="0"/>
-      <w:jc w:val="center"/>
-    </w:pPr>
-  </w:style>
-  <w:style w:type="paragraph" w:customStyle="1" w:styleId="FrontHeading">
-    <w:name w:val="Front Heading"/>
-    <w:basedOn w:val="Normal"/>
-    <w:qFormat/>
-    <w:pPr>
-      <w:keepNext/>
-      <w:keepLines/>
-      <w:spacing w:before="240" w:after="240" w:line="240" w:lineRule="auto"/>
-      <w:ind w:firstLine="0"/>
-      <w:jc w:val="center"/>
-    </w:pPr>
-    <w:rPr>
-      <w:b/>
-      <w:bCs/>
-      <w:caps/>
-    </w:rPr>
-  </w:style>
-  <w:style w:type="paragraph" w:customStyle="1" w:styleId="KeepBody">
-    <w:name w:val="Keep Body"/>
-    <w:basedOn w:val="BodyText"/>
-    <w:qFormat/>
-    <w:pPr>
-      <w:keepNext/>
-      <w:keepLines/>
-    </w:pPr>
-  </w:style>
-  <w:style w:type="paragraph" w:customStyle="1" w:styleId="Point">
-    <w:name w:val="Point"/>
-    <w:basedOn w:val="Normal"/>
-    <w:qFormat/>
-    <w:pPr>
-      <w:keepNext/>
-      <w:keepLines/>
-      <w:spacing w:before="240" w:after="240" w:line="240" w:lineRule="auto"/>
-      <w:ind w:firstLine="0"/>
-      <w:jc w:val="center"/>
-      <w:outlineLvl w:val="1"/>
-    </w:pPr>
-    <w:rPr>
-      <w:b/>
-      <w:bCs/>
-      <w:smallCaps/>
-    </w:rPr>
-  </w:style>
-  <w:style w:type="paragraph" w:customStyle="1" w:styleId="Sub1">
-    <w:name w:val="Sub 1"/>
-    <w:basedOn w:val="Normal"/>
-    <w:qFormat/>
-    <w:pPr>
-      <w:keepNext/>
-      <w:keepLines/>
-      <w:spacing w:before="240" w:after="240" w:line="240" w:lineRule="auto"/>
-      <w:ind w:left="1440" w:hanging="720" w:firstLine="0"/>
-      <w:outlineLvl w:val="1"/>
-    </w:pPr>
-    <w:rPr>
-      <w:b/>
-      <w:bCs/>
-    </w:rPr>
-  </w:style>
-  <w:style w:type="paragraph" w:customStyle="1" w:styleId="Sub2">
-    <w:name w:val="Sub 2"/>
-    <w:basedOn w:val="Normal"/>
-    <w:qFormat/>
-    <w:pPr>
-      <w:keepNext/>
-      <w:keepLines/>
-      <w:spacing w:before="240" w:after="240" w:line="240" w:lineRule="auto"/>
-      <w:ind w:left="2160" w:hanging="720" w:firstLine="0"/>
-      <w:outlineLvl w:val="2"/>
-    </w:pPr>
-    <w:rPr>
-      <w:b/>
-      <w:bCs/>
-    </w:rPr>
-  </w:style>
-  <w:style w:type="paragraph" w:customStyle="1" w:styleId="Sub3">
-    <w:name w:val="Sub 3"/>
-    <w:basedOn w:val="Normal"/>
-    <w:qFormat/>
-    <w:pPr>
-      <w:keepNext/>
-      <w:keepLines/>
-      <w:spacing w:before="240" w:after="240" w:line="240" w:lineRule="auto"/>
-      <w:ind w:left="2880" w:hanging="720" w:firstLine="0"/>
-      <w:outlineLvl w:val="3"/>
-    </w:pPr>
-    <w:rPr>
-      <w:b/>
-      <w:bCs/>
-    </w:rPr>
-  </w:style>
-  <w:style w:type="paragraph" w:customStyle="1" w:styleId="Sub4">
-    <w:name w:val="Sub 4"/>
-    <w:basedOn w:val="Normal"/>
-    <w:qFormat/>
-    <w:pPr>
-      <w:keepNext/>
-      <w:keepLines/>
-      <w:spacing w:before="240" w:after="240" w:line="240" w:lineRule="auto"/>
-      <w:ind w:left="3600" w:hanging="720" w:firstLine="0"/>
-      <w:outlineLvl w:val="4"/>
-    </w:pPr>
-    <w:rPr>
-      <w:b/>
-      <w:bCs/>
     </w:rPr>
   </w:style>
 </w:styles>

</xml_diff>